<commit_message>
fix: Update RAB to real web development and deployment costs (Rp 1.050.000)
</commit_message>
<xml_diff>
--- a/PROPOSAL_BARBERFLOW.docx
+++ b/PROPOSAL_BARBERFLOW.docx
@@ -3568,7 +3568,33 @@
         <w:spacing w:before="200" w:after="80"/>
       </w:pPr>
       <w:r>
-        <w:t>4.1 Rencana Anggaran Biaya (RAB)</w:t>
+        <w:t>4.1 Rencana Anggaran Biaya (RAB) Pembuatan Web Sampai Live</w:t>
+      </w:r>
+    </w:p>
+    <w:p>
+      <w:pPr>
+        <w:spacing w:after="80"/>
+      </w:pPr>
+      <w:r>
+        <w:t xml:space="preserve">Berikut adalah rincian anggaran biaya riil yang dibutuhkan untuk pembuatan, pengujian, hingga pengoperasian web </w:t>
+      </w:r>
+      <w:r>
+        <w:rPr>
+          <w:b/>
+        </w:rPr>
+        <w:t>BarberFlow</w:t>
+      </w:r>
+      <w:r>
+        <w:t xml:space="preserve"> secara </w:t>
+      </w:r>
+      <w:r>
+        <w:rPr>
+          <w:i/>
+        </w:rPr>
+        <w:t>live</w:t>
+      </w:r>
+      <w:r>
+        <w:t>:</w:t>
       </w:r>
     </w:p>
     <w:tbl>
@@ -3586,17 +3612,18 @@
         </w:tblBorders>
       </w:tblPr>
       <w:tblGrid>
-        <w:gridCol w:w="1500"/>
-        <w:gridCol w:w="1500"/>
-        <w:gridCol w:w="1500"/>
-        <w:gridCol w:w="1500"/>
-        <w:gridCol w:w="1500"/>
-        <w:gridCol w:w="1500"/>
+        <w:gridCol w:w="1286"/>
+        <w:gridCol w:w="1286"/>
+        <w:gridCol w:w="1286"/>
+        <w:gridCol w:w="1286"/>
+        <w:gridCol w:w="1286"/>
+        <w:gridCol w:w="1286"/>
+        <w:gridCol w:w="1286"/>
       </w:tblGrid>
       <w:tr>
         <w:tc>
           <w:tcPr>
-            <w:tcW w:type="dxa" w:w="1500"/>
+            <w:tcW w:type="dxa" w:w="1286"/>
             <w:shd w:fill="1E293B"/>
           </w:tcPr>
           <w:p>
@@ -3615,7 +3642,7 @@
         </w:tc>
         <w:tc>
           <w:tcPr>
-            <w:tcW w:type="dxa" w:w="1500"/>
+            <w:tcW w:type="dxa" w:w="1286"/>
             <w:shd w:fill="1E293B"/>
           </w:tcPr>
           <w:p>
@@ -3634,7 +3661,26 @@
         </w:tc>
         <w:tc>
           <w:tcPr>
-            <w:tcW w:type="dxa" w:w="1500"/>
+            <w:tcW w:type="dxa" w:w="1286"/>
+            <w:shd w:fill="1E293B"/>
+          </w:tcPr>
+          <w:p>
+            <w:pPr>
+              <w:spacing w:before="80" w:after="80"/>
+            </w:pPr>
+            <w:r>
+              <w:rPr>
+                <w:b/>
+                <w:color w:val="FFFFFF"/>
+                <w:sz w:val="20"/>
+              </w:rPr>
+              <w:t>Keterangan &amp; Deskripsi</w:t>
+            </w:r>
+          </w:p>
+        </w:tc>
+        <w:tc>
+          <w:tcPr>
+            <w:tcW w:type="dxa" w:w="1286"/>
             <w:shd w:fill="1E293B"/>
           </w:tcPr>
           <w:p>
@@ -3653,7 +3699,7 @@
         </w:tc>
         <w:tc>
           <w:tcPr>
-            <w:tcW w:type="dxa" w:w="1500"/>
+            <w:tcW w:type="dxa" w:w="1286"/>
             <w:shd w:fill="1E293B"/>
           </w:tcPr>
           <w:p>
@@ -3672,7 +3718,7 @@
         </w:tc>
         <w:tc>
           <w:tcPr>
-            <w:tcW w:type="dxa" w:w="1500"/>
+            <w:tcW w:type="dxa" w:w="1286"/>
             <w:shd w:fill="1E293B"/>
           </w:tcPr>
           <w:p>
@@ -3685,13 +3731,13 @@
                 <w:color w:val="FFFFFF"/>
                 <w:sz w:val="20"/>
               </w:rPr>
-              <w:t>Harga Satuan (Rp)</w:t>
+              <w:t>Biaya Satuan (Rp)</w:t>
             </w:r>
           </w:p>
         </w:tc>
         <w:tc>
           <w:tcPr>
-            <w:tcW w:type="dxa" w:w="1500"/>
+            <w:tcW w:type="dxa" w:w="1286"/>
             <w:shd w:fill="1E293B"/>
           </w:tcPr>
           <w:p>
@@ -3704,7 +3750,7 @@
                 <w:color w:val="FFFFFF"/>
                 <w:sz w:val="20"/>
               </w:rPr>
-              <w:t>Total Harga (Rp)</w:t>
+              <w:t>Total Biaya (Rp)</w:t>
             </w:r>
           </w:p>
         </w:tc>
@@ -3712,7 +3758,7 @@
       <w:tr>
         <w:tc>
           <w:tcPr>
-            <w:tcW w:type="dxa" w:w="1500"/>
+            <w:tcW w:type="dxa" w:w="1286"/>
             <w:shd w:fill="F8FAFC"/>
           </w:tcPr>
           <w:p>
@@ -3723,13 +3769,13 @@
               <w:rPr>
                 <w:sz w:val="19"/>
               </w:rPr>
-              <w:t>**A**</w:t>
+              <w:t>1</w:t>
             </w:r>
           </w:p>
         </w:tc>
         <w:tc>
           <w:tcPr>
-            <w:tcW w:type="dxa" w:w="1500"/>
+            <w:tcW w:type="dxa" w:w="1286"/>
             <w:shd w:fill="F8FAFC"/>
           </w:tcPr>
           <w:p>
@@ -3740,13 +3786,13 @@
               <w:rPr>
                 <w:sz w:val="19"/>
               </w:rPr>
-              <w:t>**Tahap Analisis &amp; Desain (UI/UX)**</w:t>
+              <w:t>**Domain Custom (.com / .id)**</w:t>
             </w:r>
           </w:p>
         </w:tc>
         <w:tc>
           <w:tcPr>
-            <w:tcW w:type="dxa" w:w="1500"/>
+            <w:tcW w:type="dxa" w:w="1286"/>
             <w:shd w:fill="F8FAFC"/>
           </w:tcPr>
           <w:p>
@@ -3757,12 +3803,13 @@
               <w:rPr>
                 <w:sz w:val="19"/>
               </w:rPr>
+              <w:t>Registrasi alamat web resmi (`barberflow.id` / `barberflow.com`) 1 tahun</w:t>
             </w:r>
           </w:p>
         </w:tc>
         <w:tc>
           <w:tcPr>
-            <w:tcW w:type="dxa" w:w="1500"/>
+            <w:tcW w:type="dxa" w:w="1286"/>
             <w:shd w:fill="F8FAFC"/>
           </w:tcPr>
           <w:p>
@@ -3773,12 +3820,13 @@
               <w:rPr>
                 <w:sz w:val="19"/>
               </w:rPr>
+              <w:t>1</w:t>
             </w:r>
           </w:p>
         </w:tc>
         <w:tc>
           <w:tcPr>
-            <w:tcW w:type="dxa" w:w="1500"/>
+            <w:tcW w:type="dxa" w:w="1286"/>
             <w:shd w:fill="F8FAFC"/>
           </w:tcPr>
           <w:p>
@@ -3789,12 +3837,13 @@
               <w:rPr>
                 <w:sz w:val="19"/>
               </w:rPr>
+              <w:t>Tahun</w:t>
             </w:r>
           </w:p>
         </w:tc>
         <w:tc>
           <w:tcPr>
-            <w:tcW w:type="dxa" w:w="1500"/>
+            <w:tcW w:type="dxa" w:w="1286"/>
             <w:shd w:fill="F8FAFC"/>
           </w:tcPr>
           <w:p>
@@ -3805,6 +3854,24 @@
               <w:rPr>
                 <w:sz w:val="19"/>
               </w:rPr>
+              <w:t>150.000</w:t>
+            </w:r>
+          </w:p>
+        </w:tc>
+        <w:tc>
+          <w:tcPr>
+            <w:tcW w:type="dxa" w:w="1286"/>
+            <w:shd w:fill="F8FAFC"/>
+          </w:tcPr>
+          <w:p>
+            <w:pPr>
+              <w:spacing w:before="80" w:after="80"/>
+            </w:pPr>
+            <w:r>
+              <w:rPr>
+                <w:sz w:val="19"/>
+              </w:rPr>
+              <w:t>150.000</w:t>
             </w:r>
           </w:p>
         </w:tc>
@@ -3812,7 +3879,58 @@
       <w:tr>
         <w:tc>
           <w:tcPr>
-            <w:tcW w:type="dxa" w:w="1500"/>
+            <w:tcW w:type="dxa" w:w="1286"/>
+            <w:shd w:fill="FFFFFF"/>
+          </w:tcPr>
+          <w:p>
+            <w:pPr>
+              <w:spacing w:before="80" w:after="80"/>
+            </w:pPr>
+            <w:r>
+              <w:rPr>
+                <w:sz w:val="19"/>
+              </w:rPr>
+              <w:t>2</w:t>
+            </w:r>
+          </w:p>
+        </w:tc>
+        <w:tc>
+          <w:tcPr>
+            <w:tcW w:type="dxa" w:w="1286"/>
+            <w:shd w:fill="FFFFFF"/>
+          </w:tcPr>
+          <w:p>
+            <w:pPr>
+              <w:spacing w:before="80" w:after="80"/>
+            </w:pPr>
+            <w:r>
+              <w:rPr>
+                <w:sz w:val="19"/>
+              </w:rPr>
+              <w:t>**Cloud Hosting / VPS Web Server**</w:t>
+            </w:r>
+          </w:p>
+        </w:tc>
+        <w:tc>
+          <w:tcPr>
+            <w:tcW w:type="dxa" w:w="1286"/>
+            <w:shd w:fill="FFFFFF"/>
+          </w:tcPr>
+          <w:p>
+            <w:pPr>
+              <w:spacing w:before="80" w:after="80"/>
+            </w:pPr>
+            <w:r>
+              <w:rPr>
+                <w:sz w:val="19"/>
+              </w:rPr>
+              <w:t>Penyewaan server web cloud (Vercel / VPS Server) 1 tahun</w:t>
+            </w:r>
+          </w:p>
+        </w:tc>
+        <w:tc>
+          <w:tcPr>
+            <w:tcW w:type="dxa" w:w="1286"/>
             <w:shd w:fill="FFFFFF"/>
           </w:tcPr>
           <w:p>
@@ -3829,7 +3947,7 @@
         </w:tc>
         <w:tc>
           <w:tcPr>
-            <w:tcW w:type="dxa" w:w="1500"/>
+            <w:tcW w:type="dxa" w:w="1286"/>
             <w:shd w:fill="FFFFFF"/>
           </w:tcPr>
           <w:p>
@@ -3840,13 +3958,13 @@
               <w:rPr>
                 <w:sz w:val="19"/>
               </w:rPr>
-              <w:t>System Requirement Analysis &amp; Wireframing</w:t>
+              <w:t>Tahun</w:t>
             </w:r>
           </w:p>
         </w:tc>
         <w:tc>
           <w:tcPr>
-            <w:tcW w:type="dxa" w:w="1500"/>
+            <w:tcW w:type="dxa" w:w="1286"/>
             <w:shd w:fill="FFFFFF"/>
           </w:tcPr>
           <w:p>
@@ -3857,13 +3975,13 @@
               <w:rPr>
                 <w:sz w:val="19"/>
               </w:rPr>
-              <w:t>1</w:t>
+              <w:t>350.000</w:t>
             </w:r>
           </w:p>
         </w:tc>
         <w:tc>
           <w:tcPr>
-            <w:tcW w:type="dxa" w:w="1500"/>
+            <w:tcW w:type="dxa" w:w="1286"/>
             <w:shd w:fill="FFFFFF"/>
           </w:tcPr>
           <w:p>
@@ -3874,41 +3992,7 @@
               <w:rPr>
                 <w:sz w:val="19"/>
               </w:rPr>
-              <w:t>Paket</w:t>
-            </w:r>
-          </w:p>
-        </w:tc>
-        <w:tc>
-          <w:tcPr>
-            <w:tcW w:type="dxa" w:w="1500"/>
-            <w:shd w:fill="FFFFFF"/>
-          </w:tcPr>
-          <w:p>
-            <w:pPr>
-              <w:spacing w:before="80" w:after="80"/>
-            </w:pPr>
-            <w:r>
-              <w:rPr>
-                <w:sz w:val="19"/>
-              </w:rPr>
-              <w:t>750.000</w:t>
-            </w:r>
-          </w:p>
-        </w:tc>
-        <w:tc>
-          <w:tcPr>
-            <w:tcW w:type="dxa" w:w="1500"/>
-            <w:shd w:fill="FFFFFF"/>
-          </w:tcPr>
-          <w:p>
-            <w:pPr>
-              <w:spacing w:before="80" w:after="80"/>
-            </w:pPr>
-            <w:r>
-              <w:rPr>
-                <w:sz w:val="19"/>
-              </w:rPr>
-              <w:t>750.000</w:t>
+              <w:t>350.000</w:t>
             </w:r>
           </w:p>
         </w:tc>
@@ -3916,7 +4000,7 @@
       <w:tr>
         <w:tc>
           <w:tcPr>
-            <w:tcW w:type="dxa" w:w="1500"/>
+            <w:tcW w:type="dxa" w:w="1286"/>
             <w:shd w:fill="F8FAFC"/>
           </w:tcPr>
           <w:p>
@@ -3927,13 +4011,13 @@
               <w:rPr>
                 <w:sz w:val="19"/>
               </w:rPr>
-              <w:t>2</w:t>
+              <w:t>3</w:t>
             </w:r>
           </w:p>
         </w:tc>
         <w:tc>
           <w:tcPr>
-            <w:tcW w:type="dxa" w:w="1500"/>
+            <w:tcW w:type="dxa" w:w="1286"/>
             <w:shd w:fill="F8FAFC"/>
           </w:tcPr>
           <w:p>
@@ -3944,13 +4028,30 @@
               <w:rPr>
                 <w:sz w:val="19"/>
               </w:rPr>
-              <w:t>Perancangan Database &amp; Diagram System</w:t>
+              <w:t>**Printer Thermal Struk 58mm**</w:t>
             </w:r>
           </w:p>
         </w:tc>
         <w:tc>
           <w:tcPr>
-            <w:tcW w:type="dxa" w:w="1500"/>
+            <w:tcW w:type="dxa" w:w="1286"/>
+            <w:shd w:fill="F8FAFC"/>
+          </w:tcPr>
+          <w:p>
+            <w:pPr>
+              <w:spacing w:before="80" w:after="80"/>
+            </w:pPr>
+            <w:r>
+              <w:rPr>
+                <w:sz w:val="19"/>
+              </w:rPr>
+              <w:t>Perangkat keras printer struk POS kasir (Bluetooth/USB)</w:t>
+            </w:r>
+          </w:p>
+        </w:tc>
+        <w:tc>
+          <w:tcPr>
+            <w:tcW w:type="dxa" w:w="1286"/>
             <w:shd w:fill="F8FAFC"/>
           </w:tcPr>
           <w:p>
@@ -3967,831 +4068,7 @@
         </w:tc>
         <w:tc>
           <w:tcPr>
-            <w:tcW w:type="dxa" w:w="1500"/>
-            <w:shd w:fill="F8FAFC"/>
-          </w:tcPr>
-          <w:p>
-            <w:pPr>
-              <w:spacing w:before="80" w:after="80"/>
-            </w:pPr>
-            <w:r>
-              <w:rPr>
-                <w:sz w:val="19"/>
-              </w:rPr>
-              <w:t>Paket</w:t>
-            </w:r>
-          </w:p>
-        </w:tc>
-        <w:tc>
-          <w:tcPr>
-            <w:tcW w:type="dxa" w:w="1500"/>
-            <w:shd w:fill="F8FAFC"/>
-          </w:tcPr>
-          <w:p>
-            <w:pPr>
-              <w:spacing w:before="80" w:after="80"/>
-            </w:pPr>
-            <w:r>
-              <w:rPr>
-                <w:sz w:val="19"/>
-              </w:rPr>
-              <w:t>500.000</w:t>
-            </w:r>
-          </w:p>
-        </w:tc>
-        <w:tc>
-          <w:tcPr>
-            <w:tcW w:type="dxa" w:w="1500"/>
-            <w:shd w:fill="F8FAFC"/>
-          </w:tcPr>
-          <w:p>
-            <w:pPr>
-              <w:spacing w:before="80" w:after="80"/>
-            </w:pPr>
-            <w:r>
-              <w:rPr>
-                <w:sz w:val="19"/>
-              </w:rPr>
-              <w:t>500.000</w:t>
-            </w:r>
-          </w:p>
-        </w:tc>
-      </w:tr>
-      <w:tr>
-        <w:tc>
-          <w:tcPr>
-            <w:tcW w:type="dxa" w:w="1500"/>
-            <w:shd w:fill="FFFFFF"/>
-          </w:tcPr>
-          <w:p>
-            <w:pPr>
-              <w:spacing w:before="80" w:after="80"/>
-            </w:pPr>
-            <w:r>
-              <w:rPr>
-                <w:sz w:val="19"/>
-              </w:rPr>
-              <w:t>**B**</w:t>
-            </w:r>
-          </w:p>
-        </w:tc>
-        <w:tc>
-          <w:tcPr>
-            <w:tcW w:type="dxa" w:w="1500"/>
-            <w:shd w:fill="FFFFFF"/>
-          </w:tcPr>
-          <w:p>
-            <w:pPr>
-              <w:spacing w:before="80" w:after="80"/>
-            </w:pPr>
-            <w:r>
-              <w:rPr>
-                <w:sz w:val="19"/>
-              </w:rPr>
-              <w:t>**Tahap Pemrograman &amp; Frontend/Backend**</w:t>
-            </w:r>
-          </w:p>
-        </w:tc>
-        <w:tc>
-          <w:tcPr>
-            <w:tcW w:type="dxa" w:w="1500"/>
-            <w:shd w:fill="FFFFFF"/>
-          </w:tcPr>
-          <w:p>
-            <w:pPr>
-              <w:spacing w:before="80" w:after="80"/>
-            </w:pPr>
-            <w:r>
-              <w:rPr>
-                <w:sz w:val="19"/>
-              </w:rPr>
-            </w:r>
-          </w:p>
-        </w:tc>
-        <w:tc>
-          <w:tcPr>
-            <w:tcW w:type="dxa" w:w="1500"/>
-            <w:shd w:fill="FFFFFF"/>
-          </w:tcPr>
-          <w:p>
-            <w:pPr>
-              <w:spacing w:before="80" w:after="80"/>
-            </w:pPr>
-            <w:r>
-              <w:rPr>
-                <w:sz w:val="19"/>
-              </w:rPr>
-            </w:r>
-          </w:p>
-        </w:tc>
-        <w:tc>
-          <w:tcPr>
-            <w:tcW w:type="dxa" w:w="1500"/>
-            <w:shd w:fill="FFFFFF"/>
-          </w:tcPr>
-          <w:p>
-            <w:pPr>
-              <w:spacing w:before="80" w:after="80"/>
-            </w:pPr>
-            <w:r>
-              <w:rPr>
-                <w:sz w:val="19"/>
-              </w:rPr>
-            </w:r>
-          </w:p>
-        </w:tc>
-        <w:tc>
-          <w:tcPr>
-            <w:tcW w:type="dxa" w:w="1500"/>
-            <w:shd w:fill="FFFFFF"/>
-          </w:tcPr>
-          <w:p>
-            <w:pPr>
-              <w:spacing w:before="80" w:after="80"/>
-            </w:pPr>
-            <w:r>
-              <w:rPr>
-                <w:sz w:val="19"/>
-              </w:rPr>
-            </w:r>
-          </w:p>
-        </w:tc>
-      </w:tr>
-      <w:tr>
-        <w:tc>
-          <w:tcPr>
-            <w:tcW w:type="dxa" w:w="1500"/>
-            <w:shd w:fill="F8FAFC"/>
-          </w:tcPr>
-          <w:p>
-            <w:pPr>
-              <w:spacing w:before="80" w:after="80"/>
-            </w:pPr>
-            <w:r>
-              <w:rPr>
-                <w:sz w:val="19"/>
-              </w:rPr>
-              <w:t>3</w:t>
-            </w:r>
-          </w:p>
-        </w:tc>
-        <w:tc>
-          <w:tcPr>
-            <w:tcW w:type="dxa" w:w="1500"/>
-            <w:shd w:fill="F8FAFC"/>
-          </w:tcPr>
-          <w:p>
-            <w:pPr>
-              <w:spacing w:before="80" w:after="80"/>
-            </w:pPr>
-            <w:r>
-              <w:rPr>
-                <w:sz w:val="19"/>
-              </w:rPr>
-              <w:t>Frontend React.js + TypeScript Development</w:t>
-            </w:r>
-          </w:p>
-        </w:tc>
-        <w:tc>
-          <w:tcPr>
-            <w:tcW w:type="dxa" w:w="1500"/>
-            <w:shd w:fill="F8FAFC"/>
-          </w:tcPr>
-          <w:p>
-            <w:pPr>
-              <w:spacing w:before="80" w:after="80"/>
-            </w:pPr>
-            <w:r>
-              <w:rPr>
-                <w:sz w:val="19"/>
-              </w:rPr>
-              <w:t>1</w:t>
-            </w:r>
-          </w:p>
-        </w:tc>
-        <w:tc>
-          <w:tcPr>
-            <w:tcW w:type="dxa" w:w="1500"/>
-            <w:shd w:fill="F8FAFC"/>
-          </w:tcPr>
-          <w:p>
-            <w:pPr>
-              <w:spacing w:before="80" w:after="80"/>
-            </w:pPr>
-            <w:r>
-              <w:rPr>
-                <w:sz w:val="19"/>
-              </w:rPr>
-              <w:t>Aplikasi</w:t>
-            </w:r>
-          </w:p>
-        </w:tc>
-        <w:tc>
-          <w:tcPr>
-            <w:tcW w:type="dxa" w:w="1500"/>
-            <w:shd w:fill="F8FAFC"/>
-          </w:tcPr>
-          <w:p>
-            <w:pPr>
-              <w:spacing w:before="80" w:after="80"/>
-            </w:pPr>
-            <w:r>
-              <w:rPr>
-                <w:sz w:val="19"/>
-              </w:rPr>
-              <w:t>2.500.000</w:t>
-            </w:r>
-          </w:p>
-        </w:tc>
-        <w:tc>
-          <w:tcPr>
-            <w:tcW w:type="dxa" w:w="1500"/>
-            <w:shd w:fill="F8FAFC"/>
-          </w:tcPr>
-          <w:p>
-            <w:pPr>
-              <w:spacing w:before="80" w:after="80"/>
-            </w:pPr>
-            <w:r>
-              <w:rPr>
-                <w:sz w:val="19"/>
-              </w:rPr>
-              <w:t>2.500.000</w:t>
-            </w:r>
-          </w:p>
-        </w:tc>
-      </w:tr>
-      <w:tr>
-        <w:tc>
-          <w:tcPr>
-            <w:tcW w:type="dxa" w:w="1500"/>
-            <w:shd w:fill="FFFFFF"/>
-          </w:tcPr>
-          <w:p>
-            <w:pPr>
-              <w:spacing w:before="80" w:after="80"/>
-            </w:pPr>
-            <w:r>
-              <w:rPr>
-                <w:sz w:val="19"/>
-              </w:rPr>
-              <w:t>4</w:t>
-            </w:r>
-          </w:p>
-        </w:tc>
-        <w:tc>
-          <w:tcPr>
-            <w:tcW w:type="dxa" w:w="1500"/>
-            <w:shd w:fill="FFFFFF"/>
-          </w:tcPr>
-          <w:p>
-            <w:pPr>
-              <w:spacing w:before="80" w:after="80"/>
-            </w:pPr>
-            <w:r>
-              <w:rPr>
-                <w:sz w:val="19"/>
-              </w:rPr>
-              <w:t>Backend Laravel 11 REST API &amp; Database Sync</w:t>
-            </w:r>
-          </w:p>
-        </w:tc>
-        <w:tc>
-          <w:tcPr>
-            <w:tcW w:type="dxa" w:w="1500"/>
-            <w:shd w:fill="FFFFFF"/>
-          </w:tcPr>
-          <w:p>
-            <w:pPr>
-              <w:spacing w:before="80" w:after="80"/>
-            </w:pPr>
-            <w:r>
-              <w:rPr>
-                <w:sz w:val="19"/>
-              </w:rPr>
-              <w:t>1</w:t>
-            </w:r>
-          </w:p>
-        </w:tc>
-        <w:tc>
-          <w:tcPr>
-            <w:tcW w:type="dxa" w:w="1500"/>
-            <w:shd w:fill="FFFFFF"/>
-          </w:tcPr>
-          <w:p>
-            <w:pPr>
-              <w:spacing w:before="80" w:after="80"/>
-            </w:pPr>
-            <w:r>
-              <w:rPr>
-                <w:sz w:val="19"/>
-              </w:rPr>
-              <w:t>Modul</w:t>
-            </w:r>
-          </w:p>
-        </w:tc>
-        <w:tc>
-          <w:tcPr>
-            <w:tcW w:type="dxa" w:w="1500"/>
-            <w:shd w:fill="FFFFFF"/>
-          </w:tcPr>
-          <w:p>
-            <w:pPr>
-              <w:spacing w:before="80" w:after="80"/>
-            </w:pPr>
-            <w:r>
-              <w:rPr>
-                <w:sz w:val="19"/>
-              </w:rPr>
-              <w:t>2.000.000</w:t>
-            </w:r>
-          </w:p>
-        </w:tc>
-        <w:tc>
-          <w:tcPr>
-            <w:tcW w:type="dxa" w:w="1500"/>
-            <w:shd w:fill="FFFFFF"/>
-          </w:tcPr>
-          <w:p>
-            <w:pPr>
-              <w:spacing w:before="80" w:after="80"/>
-            </w:pPr>
-            <w:r>
-              <w:rPr>
-                <w:sz w:val="19"/>
-              </w:rPr>
-              <w:t>2.000.000</w:t>
-            </w:r>
-          </w:p>
-        </w:tc>
-      </w:tr>
-      <w:tr>
-        <w:tc>
-          <w:tcPr>
-            <w:tcW w:type="dxa" w:w="1500"/>
-            <w:shd w:fill="F8FAFC"/>
-          </w:tcPr>
-          <w:p>
-            <w:pPr>
-              <w:spacing w:before="80" w:after="80"/>
-            </w:pPr>
-            <w:r>
-              <w:rPr>
-                <w:sz w:val="19"/>
-              </w:rPr>
-              <w:t>5</w:t>
-            </w:r>
-          </w:p>
-        </w:tc>
-        <w:tc>
-          <w:tcPr>
-            <w:tcW w:type="dxa" w:w="1500"/>
-            <w:shd w:fill="F8FAFC"/>
-          </w:tcPr>
-          <w:p>
-            <w:pPr>
-              <w:spacing w:before="80" w:after="80"/>
-            </w:pPr>
-            <w:r>
-              <w:rPr>
-                <w:sz w:val="19"/>
-              </w:rPr>
-              <w:t>Offline-First IndexedDB Sync Implementation</w:t>
-            </w:r>
-          </w:p>
-        </w:tc>
-        <w:tc>
-          <w:tcPr>
-            <w:tcW w:type="dxa" w:w="1500"/>
-            <w:shd w:fill="F8FAFC"/>
-          </w:tcPr>
-          <w:p>
-            <w:pPr>
-              <w:spacing w:before="80" w:after="80"/>
-            </w:pPr>
-            <w:r>
-              <w:rPr>
-                <w:sz w:val="19"/>
-              </w:rPr>
-              <w:t>1</w:t>
-            </w:r>
-          </w:p>
-        </w:tc>
-        <w:tc>
-          <w:tcPr>
-            <w:tcW w:type="dxa" w:w="1500"/>
-            <w:shd w:fill="F8FAFC"/>
-          </w:tcPr>
-          <w:p>
-            <w:pPr>
-              <w:spacing w:before="80" w:after="80"/>
-            </w:pPr>
-            <w:r>
-              <w:rPr>
-                <w:sz w:val="19"/>
-              </w:rPr>
-              <w:t>Modul</w:t>
-            </w:r>
-          </w:p>
-        </w:tc>
-        <w:tc>
-          <w:tcPr>
-            <w:tcW w:type="dxa" w:w="1500"/>
-            <w:shd w:fill="F8FAFC"/>
-          </w:tcPr>
-          <w:p>
-            <w:pPr>
-              <w:spacing w:before="80" w:after="80"/>
-            </w:pPr>
-            <w:r>
-              <w:rPr>
-                <w:sz w:val="19"/>
-              </w:rPr>
-              <w:t>1.250.000</w:t>
-            </w:r>
-          </w:p>
-        </w:tc>
-        <w:tc>
-          <w:tcPr>
-            <w:tcW w:type="dxa" w:w="1500"/>
-            <w:shd w:fill="F8FAFC"/>
-          </w:tcPr>
-          <w:p>
-            <w:pPr>
-              <w:spacing w:before="80" w:after="80"/>
-            </w:pPr>
-            <w:r>
-              <w:rPr>
-                <w:sz w:val="19"/>
-              </w:rPr>
-              <w:t>1.250.000</w:t>
-            </w:r>
-          </w:p>
-        </w:tc>
-      </w:tr>
-      <w:tr>
-        <w:tc>
-          <w:tcPr>
-            <w:tcW w:type="dxa" w:w="1500"/>
-            <w:shd w:fill="FFFFFF"/>
-          </w:tcPr>
-          <w:p>
-            <w:pPr>
-              <w:spacing w:before="80" w:after="80"/>
-            </w:pPr>
-            <w:r>
-              <w:rPr>
-                <w:sz w:val="19"/>
-              </w:rPr>
-              <w:t>**C**</w:t>
-            </w:r>
-          </w:p>
-        </w:tc>
-        <w:tc>
-          <w:tcPr>
-            <w:tcW w:type="dxa" w:w="1500"/>
-            <w:shd w:fill="FFFFFF"/>
-          </w:tcPr>
-          <w:p>
-            <w:pPr>
-              <w:spacing w:before="80" w:after="80"/>
-            </w:pPr>
-            <w:r>
-              <w:rPr>
-                <w:sz w:val="19"/>
-              </w:rPr>
-              <w:t>**Pengujian &amp; Deployment**</w:t>
-            </w:r>
-          </w:p>
-        </w:tc>
-        <w:tc>
-          <w:tcPr>
-            <w:tcW w:type="dxa" w:w="1500"/>
-            <w:shd w:fill="FFFFFF"/>
-          </w:tcPr>
-          <w:p>
-            <w:pPr>
-              <w:spacing w:before="80" w:after="80"/>
-            </w:pPr>
-            <w:r>
-              <w:rPr>
-                <w:sz w:val="19"/>
-              </w:rPr>
-            </w:r>
-          </w:p>
-        </w:tc>
-        <w:tc>
-          <w:tcPr>
-            <w:tcW w:type="dxa" w:w="1500"/>
-            <w:shd w:fill="FFFFFF"/>
-          </w:tcPr>
-          <w:p>
-            <w:pPr>
-              <w:spacing w:before="80" w:after="80"/>
-            </w:pPr>
-            <w:r>
-              <w:rPr>
-                <w:sz w:val="19"/>
-              </w:rPr>
-            </w:r>
-          </w:p>
-        </w:tc>
-        <w:tc>
-          <w:tcPr>
-            <w:tcW w:type="dxa" w:w="1500"/>
-            <w:shd w:fill="FFFFFF"/>
-          </w:tcPr>
-          <w:p>
-            <w:pPr>
-              <w:spacing w:before="80" w:after="80"/>
-            </w:pPr>
-            <w:r>
-              <w:rPr>
-                <w:sz w:val="19"/>
-              </w:rPr>
-            </w:r>
-          </w:p>
-        </w:tc>
-        <w:tc>
-          <w:tcPr>
-            <w:tcW w:type="dxa" w:w="1500"/>
-            <w:shd w:fill="FFFFFF"/>
-          </w:tcPr>
-          <w:p>
-            <w:pPr>
-              <w:spacing w:before="80" w:after="80"/>
-            </w:pPr>
-            <w:r>
-              <w:rPr>
-                <w:sz w:val="19"/>
-              </w:rPr>
-            </w:r>
-          </w:p>
-        </w:tc>
-      </w:tr>
-      <w:tr>
-        <w:tc>
-          <w:tcPr>
-            <w:tcW w:type="dxa" w:w="1500"/>
-            <w:shd w:fill="F8FAFC"/>
-          </w:tcPr>
-          <w:p>
-            <w:pPr>
-              <w:spacing w:before="80" w:after="80"/>
-            </w:pPr>
-            <w:r>
-              <w:rPr>
-                <w:sz w:val="19"/>
-              </w:rPr>
-              <w:t>6</w:t>
-            </w:r>
-          </w:p>
-        </w:tc>
-        <w:tc>
-          <w:tcPr>
-            <w:tcW w:type="dxa" w:w="1500"/>
-            <w:shd w:fill="F8FAFC"/>
-          </w:tcPr>
-          <w:p>
-            <w:pPr>
-              <w:spacing w:before="80" w:after="80"/>
-            </w:pPr>
-            <w:r>
-              <w:rPr>
-                <w:sz w:val="19"/>
-              </w:rPr>
-              <w:t>Domain Custom (.com / .id) - 1 Tahun</w:t>
-            </w:r>
-          </w:p>
-        </w:tc>
-        <w:tc>
-          <w:tcPr>
-            <w:tcW w:type="dxa" w:w="1500"/>
-            <w:shd w:fill="F8FAFC"/>
-          </w:tcPr>
-          <w:p>
-            <w:pPr>
-              <w:spacing w:before="80" w:after="80"/>
-            </w:pPr>
-            <w:r>
-              <w:rPr>
-                <w:sz w:val="19"/>
-              </w:rPr>
-              <w:t>1</w:t>
-            </w:r>
-          </w:p>
-        </w:tc>
-        <w:tc>
-          <w:tcPr>
-            <w:tcW w:type="dxa" w:w="1500"/>
-            <w:shd w:fill="F8FAFC"/>
-          </w:tcPr>
-          <w:p>
-            <w:pPr>
-              <w:spacing w:before="80" w:after="80"/>
-            </w:pPr>
-            <w:r>
-              <w:rPr>
-                <w:sz w:val="19"/>
-              </w:rPr>
-              <w:t>Tahun</w:t>
-            </w:r>
-          </w:p>
-        </w:tc>
-        <w:tc>
-          <w:tcPr>
-            <w:tcW w:type="dxa" w:w="1500"/>
-            <w:shd w:fill="F8FAFC"/>
-          </w:tcPr>
-          <w:p>
-            <w:pPr>
-              <w:spacing w:before="80" w:after="80"/>
-            </w:pPr>
-            <w:r>
-              <w:rPr>
-                <w:sz w:val="19"/>
-              </w:rPr>
-              <w:t>200.000</w:t>
-            </w:r>
-          </w:p>
-        </w:tc>
-        <w:tc>
-          <w:tcPr>
-            <w:tcW w:type="dxa" w:w="1500"/>
-            <w:shd w:fill="F8FAFC"/>
-          </w:tcPr>
-          <w:p>
-            <w:pPr>
-              <w:spacing w:before="80" w:after="80"/>
-            </w:pPr>
-            <w:r>
-              <w:rPr>
-                <w:sz w:val="19"/>
-              </w:rPr>
-              <w:t>200.000</w:t>
-            </w:r>
-          </w:p>
-        </w:tc>
-      </w:tr>
-      <w:tr>
-        <w:tc>
-          <w:tcPr>
-            <w:tcW w:type="dxa" w:w="1500"/>
-            <w:shd w:fill="FFFFFF"/>
-          </w:tcPr>
-          <w:p>
-            <w:pPr>
-              <w:spacing w:before="80" w:after="80"/>
-            </w:pPr>
-            <w:r>
-              <w:rPr>
-                <w:sz w:val="19"/>
-              </w:rPr>
-              <w:t>7</w:t>
-            </w:r>
-          </w:p>
-        </w:tc>
-        <w:tc>
-          <w:tcPr>
-            <w:tcW w:type="dxa" w:w="1500"/>
-            <w:shd w:fill="FFFFFF"/>
-          </w:tcPr>
-          <w:p>
-            <w:pPr>
-              <w:spacing w:before="80" w:after="80"/>
-            </w:pPr>
-            <w:r>
-              <w:rPr>
-                <w:sz w:val="19"/>
-              </w:rPr>
-              <w:t>Cloud Hosting / VPS Web Server - 1 Tahun</w:t>
-            </w:r>
-          </w:p>
-        </w:tc>
-        <w:tc>
-          <w:tcPr>
-            <w:tcW w:type="dxa" w:w="1500"/>
-            <w:shd w:fill="FFFFFF"/>
-          </w:tcPr>
-          <w:p>
-            <w:pPr>
-              <w:spacing w:before="80" w:after="80"/>
-            </w:pPr>
-            <w:r>
-              <w:rPr>
-                <w:sz w:val="19"/>
-              </w:rPr>
-              <w:t>1</w:t>
-            </w:r>
-          </w:p>
-        </w:tc>
-        <w:tc>
-          <w:tcPr>
-            <w:tcW w:type="dxa" w:w="1500"/>
-            <w:shd w:fill="FFFFFF"/>
-          </w:tcPr>
-          <w:p>
-            <w:pPr>
-              <w:spacing w:before="80" w:after="80"/>
-            </w:pPr>
-            <w:r>
-              <w:rPr>
-                <w:sz w:val="19"/>
-              </w:rPr>
-              <w:t>Tahun</w:t>
-            </w:r>
-          </w:p>
-        </w:tc>
-        <w:tc>
-          <w:tcPr>
-            <w:tcW w:type="dxa" w:w="1500"/>
-            <w:shd w:fill="FFFFFF"/>
-          </w:tcPr>
-          <w:p>
-            <w:pPr>
-              <w:spacing w:before="80" w:after="80"/>
-            </w:pPr>
-            <w:r>
-              <w:rPr>
-                <w:sz w:val="19"/>
-              </w:rPr>
-              <w:t>1.200.000</w:t>
-            </w:r>
-          </w:p>
-        </w:tc>
-        <w:tc>
-          <w:tcPr>
-            <w:tcW w:type="dxa" w:w="1500"/>
-            <w:shd w:fill="FFFFFF"/>
-          </w:tcPr>
-          <w:p>
-            <w:pPr>
-              <w:spacing w:before="80" w:after="80"/>
-            </w:pPr>
-            <w:r>
-              <w:rPr>
-                <w:sz w:val="19"/>
-              </w:rPr>
-              <w:t>1.200.000</w:t>
-            </w:r>
-          </w:p>
-        </w:tc>
-      </w:tr>
-      <w:tr>
-        <w:tc>
-          <w:tcPr>
-            <w:tcW w:type="dxa" w:w="1500"/>
-            <w:shd w:fill="F8FAFC"/>
-          </w:tcPr>
-          <w:p>
-            <w:pPr>
-              <w:spacing w:before="80" w:after="80"/>
-            </w:pPr>
-            <w:r>
-              <w:rPr>
-                <w:sz w:val="19"/>
-              </w:rPr>
-              <w:t>8</w:t>
-            </w:r>
-          </w:p>
-        </w:tc>
-        <w:tc>
-          <w:tcPr>
-            <w:tcW w:type="dxa" w:w="1500"/>
-            <w:shd w:fill="F8FAFC"/>
-          </w:tcPr>
-          <w:p>
-            <w:pPr>
-              <w:spacing w:before="80" w:after="80"/>
-            </w:pPr>
-            <w:r>
-              <w:rPr>
-                <w:sz w:val="19"/>
-              </w:rPr>
-              <w:t>Thermal Bluetooth/USB Receipt Printer 58mm</w:t>
-            </w:r>
-          </w:p>
-        </w:tc>
-        <w:tc>
-          <w:tcPr>
-            <w:tcW w:type="dxa" w:w="1500"/>
-            <w:shd w:fill="F8FAFC"/>
-          </w:tcPr>
-          <w:p>
-            <w:pPr>
-              <w:spacing w:before="80" w:after="80"/>
-            </w:pPr>
-            <w:r>
-              <w:rPr>
-                <w:sz w:val="19"/>
-              </w:rPr>
-              <w:t>1</w:t>
-            </w:r>
-          </w:p>
-        </w:tc>
-        <w:tc>
-          <w:tcPr>
-            <w:tcW w:type="dxa" w:w="1500"/>
+            <w:tcW w:type="dxa" w:w="1286"/>
             <w:shd w:fill="F8FAFC"/>
           </w:tcPr>
           <w:p>
@@ -4808,7 +4085,7 @@
         </w:tc>
         <w:tc>
           <w:tcPr>
-            <w:tcW w:type="dxa" w:w="1500"/>
+            <w:tcW w:type="dxa" w:w="1286"/>
             <w:shd w:fill="F8FAFC"/>
           </w:tcPr>
           <w:p>
@@ -4825,7 +4102,7 @@
         </w:tc>
         <w:tc>
           <w:tcPr>
-            <w:tcW w:type="dxa" w:w="1500"/>
+            <w:tcW w:type="dxa" w:w="1286"/>
             <w:shd w:fill="F8FAFC"/>
           </w:tcPr>
           <w:p>
@@ -4844,7 +4121,7 @@
       <w:tr>
         <w:tc>
           <w:tcPr>
-            <w:tcW w:type="dxa" w:w="1500"/>
+            <w:tcW w:type="dxa" w:w="1286"/>
             <w:shd w:fill="FFFFFF"/>
           </w:tcPr>
           <w:p>
@@ -4855,13 +4132,13 @@
               <w:rPr>
                 <w:sz w:val="19"/>
               </w:rPr>
-              <w:t>**D**</w:t>
+              <w:t>4</w:t>
             </w:r>
           </w:p>
         </w:tc>
         <w:tc>
           <w:tcPr>
-            <w:tcW w:type="dxa" w:w="1500"/>
+            <w:tcW w:type="dxa" w:w="1286"/>
             <w:shd w:fill="FFFFFF"/>
           </w:tcPr>
           <w:p>
@@ -4872,13 +4149,13 @@
               <w:rPr>
                 <w:sz w:val="19"/>
               </w:rPr>
-              <w:t>**Dokumentasi &amp; Pelatihan**</w:t>
+              <w:t>**Kertas Thermal Struk (10 Roll)**</w:t>
             </w:r>
           </w:p>
         </w:tc>
         <w:tc>
           <w:tcPr>
-            <w:tcW w:type="dxa" w:w="1500"/>
+            <w:tcW w:type="dxa" w:w="1286"/>
             <w:shd w:fill="FFFFFF"/>
           </w:tcPr>
           <w:p>
@@ -4889,12 +4166,13 @@
               <w:rPr>
                 <w:sz w:val="19"/>
               </w:rPr>
+              <w:t>Kertas cetak nota transaksi kasir di lokasi barbershop</w:t>
             </w:r>
           </w:p>
         </w:tc>
         <w:tc>
           <w:tcPr>
-            <w:tcW w:type="dxa" w:w="1500"/>
+            <w:tcW w:type="dxa" w:w="1286"/>
             <w:shd w:fill="FFFFFF"/>
           </w:tcPr>
           <w:p>
@@ -4905,12 +4183,13 @@
               <w:rPr>
                 <w:sz w:val="19"/>
               </w:rPr>
+              <w:t>1</w:t>
             </w:r>
           </w:p>
         </w:tc>
         <w:tc>
           <w:tcPr>
-            <w:tcW w:type="dxa" w:w="1500"/>
+            <w:tcW w:type="dxa" w:w="1286"/>
             <w:shd w:fill="FFFFFF"/>
           </w:tcPr>
           <w:p>
@@ -4921,12 +4200,13 @@
               <w:rPr>
                 <w:sz w:val="19"/>
               </w:rPr>
+              <w:t>Pak</w:t>
             </w:r>
           </w:p>
         </w:tc>
         <w:tc>
           <w:tcPr>
-            <w:tcW w:type="dxa" w:w="1500"/>
+            <w:tcW w:type="dxa" w:w="1286"/>
             <w:shd w:fill="FFFFFF"/>
           </w:tcPr>
           <w:p>
@@ -4937,6 +4217,24 @@
               <w:rPr>
                 <w:sz w:val="19"/>
               </w:rPr>
+              <w:t>50.000</w:t>
+            </w:r>
+          </w:p>
+        </w:tc>
+        <w:tc>
+          <w:tcPr>
+            <w:tcW w:type="dxa" w:w="1286"/>
+            <w:shd w:fill="FFFFFF"/>
+          </w:tcPr>
+          <w:p>
+            <w:pPr>
+              <w:spacing w:before="80" w:after="80"/>
+            </w:pPr>
+            <w:r>
+              <w:rPr>
+                <w:sz w:val="19"/>
+              </w:rPr>
+              <w:t>50.000</w:t>
             </w:r>
           </w:p>
         </w:tc>
@@ -4944,7 +4242,7 @@
       <w:tr>
         <w:tc>
           <w:tcPr>
-            <w:tcW w:type="dxa" w:w="1500"/>
+            <w:tcW w:type="dxa" w:w="1286"/>
             <w:shd w:fill="F8FAFC"/>
           </w:tcPr>
           <w:p>
@@ -4955,13 +4253,13 @@
               <w:rPr>
                 <w:sz w:val="19"/>
               </w:rPr>
-              <w:t>9</w:t>
+              <w:t>5</w:t>
             </w:r>
           </w:p>
         </w:tc>
         <w:tc>
           <w:tcPr>
-            <w:tcW w:type="dxa" w:w="1500"/>
+            <w:tcW w:type="dxa" w:w="1286"/>
             <w:shd w:fill="F8FAFC"/>
           </w:tcPr>
           <w:p>
@@ -4972,13 +4270,30 @@
               <w:rPr>
                 <w:sz w:val="19"/>
               </w:rPr>
-              <w:t>Penyusunan Dokumentasi UKK &amp; User Manual</w:t>
+              <w:t>**Sertifikat Enkripsi SSL (HTTPS)**</w:t>
             </w:r>
           </w:p>
         </w:tc>
         <w:tc>
           <w:tcPr>
-            <w:tcW w:type="dxa" w:w="1500"/>
+            <w:tcW w:type="dxa" w:w="1286"/>
+            <w:shd w:fill="F8FAFC"/>
+          </w:tcPr>
+          <w:p>
+            <w:pPr>
+              <w:spacing w:before="80" w:after="80"/>
+            </w:pPr>
+            <w:r>
+              <w:rPr>
+                <w:sz w:val="19"/>
+              </w:rPr>
+              <w:t>Keamanan koneksi &amp; enkripsi data transaksi web</w:t>
+            </w:r>
+          </w:p>
+        </w:tc>
+        <w:tc>
+          <w:tcPr>
+            <w:tcW w:type="dxa" w:w="1286"/>
             <w:shd w:fill="F8FAFC"/>
           </w:tcPr>
           <w:p>
@@ -4995,7 +4310,7 @@
         </w:tc>
         <w:tc>
           <w:tcPr>
-            <w:tcW w:type="dxa" w:w="1500"/>
+            <w:tcW w:type="dxa" w:w="1286"/>
             <w:shd w:fill="F8FAFC"/>
           </w:tcPr>
           <w:p>
@@ -5012,7 +4327,7 @@
         </w:tc>
         <w:tc>
           <w:tcPr>
-            <w:tcW w:type="dxa" w:w="1500"/>
+            <w:tcW w:type="dxa" w:w="1286"/>
             <w:shd w:fill="F8FAFC"/>
           </w:tcPr>
           <w:p>
@@ -5023,13 +4338,13 @@
               <w:rPr>
                 <w:sz w:val="19"/>
               </w:rPr>
-              <w:t>500.000</w:t>
+              <w:t>0 *(Gratis/SSL)*</w:t>
             </w:r>
           </w:p>
         </w:tc>
         <w:tc>
           <w:tcPr>
-            <w:tcW w:type="dxa" w:w="1500"/>
+            <w:tcW w:type="dxa" w:w="1286"/>
             <w:shd w:fill="F8FAFC"/>
           </w:tcPr>
           <w:p>
@@ -5040,7 +4355,7 @@
               <w:rPr>
                 <w:sz w:val="19"/>
               </w:rPr>
-              <w:t>500.000</w:t>
+              <w:t>0</w:t>
             </w:r>
           </w:p>
         </w:tc>
@@ -5048,7 +4363,7 @@
       <w:tr>
         <w:tc>
           <w:tcPr>
-            <w:tcW w:type="dxa" w:w="1500"/>
+            <w:tcW w:type="dxa" w:w="1286"/>
             <w:shd w:fill="FFFFFF"/>
           </w:tcPr>
           <w:p>
@@ -5059,13 +4374,13 @@
               <w:rPr>
                 <w:sz w:val="19"/>
               </w:rPr>
-              <w:t>10</w:t>
+              <w:t>6</w:t>
             </w:r>
           </w:p>
         </w:tc>
         <w:tc>
           <w:tcPr>
-            <w:tcW w:type="dxa" w:w="1500"/>
+            <w:tcW w:type="dxa" w:w="1286"/>
             <w:shd w:fill="FFFFFF"/>
           </w:tcPr>
           <w:p>
@@ -5076,13 +4391,30 @@
               <w:rPr>
                 <w:sz w:val="19"/>
               </w:rPr>
-              <w:t>Pelatihan Operator Kasir &amp; Admin (Training)</w:t>
+              <w:t>**Cetak &amp; Jilid Proposal UKK**</w:t>
             </w:r>
           </w:p>
         </w:tc>
         <w:tc>
           <w:tcPr>
-            <w:tcW w:type="dxa" w:w="1500"/>
+            <w:tcW w:type="dxa" w:w="1286"/>
+            <w:shd w:fill="FFFFFF"/>
+          </w:tcPr>
+          <w:p>
+            <w:pPr>
+              <w:spacing w:before="80" w:after="80"/>
+            </w:pPr>
+            <w:r>
+              <w:rPr>
+                <w:sz w:val="19"/>
+              </w:rPr>
+              <w:t>Cetak penggandaan &amp; jilid dokumen proposal/laporan UKK</w:t>
+            </w:r>
+          </w:p>
+        </w:tc>
+        <w:tc>
+          <w:tcPr>
+            <w:tcW w:type="dxa" w:w="1286"/>
             <w:shd w:fill="FFFFFF"/>
           </w:tcPr>
           <w:p>
@@ -5099,7 +4431,7 @@
         </w:tc>
         <w:tc>
           <w:tcPr>
-            <w:tcW w:type="dxa" w:w="1500"/>
+            <w:tcW w:type="dxa" w:w="1286"/>
             <w:shd w:fill="FFFFFF"/>
           </w:tcPr>
           <w:p>
@@ -5116,7 +4448,7 @@
         </w:tc>
         <w:tc>
           <w:tcPr>
-            <w:tcW w:type="dxa" w:w="1500"/>
+            <w:tcW w:type="dxa" w:w="1286"/>
             <w:shd w:fill="FFFFFF"/>
           </w:tcPr>
           <w:p>
@@ -5127,13 +4459,13 @@
               <w:rPr>
                 <w:sz w:val="19"/>
               </w:rPr>
-              <w:t>450.000</w:t>
+              <w:t>100.000</w:t>
             </w:r>
           </w:p>
         </w:tc>
         <w:tc>
           <w:tcPr>
-            <w:tcW w:type="dxa" w:w="1500"/>
+            <w:tcW w:type="dxa" w:w="1286"/>
             <w:shd w:fill="FFFFFF"/>
           </w:tcPr>
           <w:p>
@@ -5144,7 +4476,7 @@
               <w:rPr>
                 <w:sz w:val="19"/>
               </w:rPr>
-              <w:t>450.000</w:t>
+              <w:t>100.000</w:t>
             </w:r>
           </w:p>
         </w:tc>
@@ -5152,7 +4484,7 @@
       <w:tr>
         <w:tc>
           <w:tcPr>
-            <w:tcW w:type="dxa" w:w="1500"/>
+            <w:tcW w:type="dxa" w:w="1286"/>
             <w:shd w:fill="F8FAFC"/>
           </w:tcPr>
           <w:p>
@@ -5163,14 +4495,135 @@
               <w:rPr>
                 <w:sz w:val="19"/>
               </w:rPr>
-              <w:t>**TOTAL KESELURAHAN ANGGARAN BIAYA (RAB)**</w:t>
+              <w:t>7</w:t>
             </w:r>
           </w:p>
         </w:tc>
         <w:tc>
           <w:tcPr>
-            <w:tcW w:type="dxa" w:w="1500"/>
+            <w:tcW w:type="dxa" w:w="1286"/>
             <w:shd w:fill="F8FAFC"/>
+          </w:tcPr>
+          <w:p>
+            <w:pPr>
+              <w:spacing w:before="80" w:after="80"/>
+            </w:pPr>
+            <w:r>
+              <w:rPr>
+                <w:sz w:val="19"/>
+              </w:rPr>
+              <w:t>**Koneksi Internet &amp; Testing**</w:t>
+            </w:r>
+          </w:p>
+        </w:tc>
+        <w:tc>
+          <w:tcPr>
+            <w:tcW w:type="dxa" w:w="1286"/>
+            <w:shd w:fill="F8FAFC"/>
+          </w:tcPr>
+          <w:p>
+            <w:pPr>
+              <w:spacing w:before="80" w:after="80"/>
+            </w:pPr>
+            <w:r>
+              <w:rPr>
+                <w:sz w:val="19"/>
+              </w:rPr>
+              <w:t>Kuota data internet untuk pengujian &amp; deployment live</w:t>
+            </w:r>
+          </w:p>
+        </w:tc>
+        <w:tc>
+          <w:tcPr>
+            <w:tcW w:type="dxa" w:w="1286"/>
+            <w:shd w:fill="F8FAFC"/>
+          </w:tcPr>
+          <w:p>
+            <w:pPr>
+              <w:spacing w:before="80" w:after="80"/>
+            </w:pPr>
+            <w:r>
+              <w:rPr>
+                <w:sz w:val="19"/>
+              </w:rPr>
+              <w:t>1</w:t>
+            </w:r>
+          </w:p>
+        </w:tc>
+        <w:tc>
+          <w:tcPr>
+            <w:tcW w:type="dxa" w:w="1286"/>
+            <w:shd w:fill="F8FAFC"/>
+          </w:tcPr>
+          <w:p>
+            <w:pPr>
+              <w:spacing w:before="80" w:after="80"/>
+            </w:pPr>
+            <w:r>
+              <w:rPr>
+                <w:sz w:val="19"/>
+              </w:rPr>
+              <w:t>Paket</w:t>
+            </w:r>
+          </w:p>
+        </w:tc>
+        <w:tc>
+          <w:tcPr>
+            <w:tcW w:type="dxa" w:w="1286"/>
+            <w:shd w:fill="F8FAFC"/>
+          </w:tcPr>
+          <w:p>
+            <w:pPr>
+              <w:spacing w:before="80" w:after="80"/>
+            </w:pPr>
+            <w:r>
+              <w:rPr>
+                <w:sz w:val="19"/>
+              </w:rPr>
+              <w:t>50.000</w:t>
+            </w:r>
+          </w:p>
+        </w:tc>
+        <w:tc>
+          <w:tcPr>
+            <w:tcW w:type="dxa" w:w="1286"/>
+            <w:shd w:fill="F8FAFC"/>
+          </w:tcPr>
+          <w:p>
+            <w:pPr>
+              <w:spacing w:before="80" w:after="80"/>
+            </w:pPr>
+            <w:r>
+              <w:rPr>
+                <w:sz w:val="19"/>
+              </w:rPr>
+              <w:t>50.000</w:t>
+            </w:r>
+          </w:p>
+        </w:tc>
+      </w:tr>
+      <w:tr>
+        <w:tc>
+          <w:tcPr>
+            <w:tcW w:type="dxa" w:w="1286"/>
+            <w:shd w:fill="FFFFFF"/>
+          </w:tcPr>
+          <w:p>
+            <w:pPr>
+              <w:spacing w:before="80" w:after="80"/>
+            </w:pPr>
+            <w:r>
+              <w:rPr>
+                <w:sz w:val="19"/>
+              </w:rPr>
+              <w:t>**TOTAL KESELURUHAN ANGGARAN BIAYA (RAB)**</w:t>
+            </w:r>
+          </w:p>
+        </w:tc>
+        <w:tc>
+          <w:tcPr>
+            <w:tcW w:type="dxa" w:w="1286"/>
+            <w:shd w:fill="FFFFFF"/>
           </w:tcPr>
           <w:p>
             <w:pPr>
@@ -5185,8 +4638,8 @@
         </w:tc>
         <w:tc>
           <w:tcPr>
-            <w:tcW w:type="dxa" w:w="1500"/>
-            <w:shd w:fill="F8FAFC"/>
+            <w:tcW w:type="dxa" w:w="1286"/>
+            <w:shd w:fill="FFFFFF"/>
           </w:tcPr>
           <w:p>
             <w:pPr>
@@ -5201,8 +4654,8 @@
         </w:tc>
         <w:tc>
           <w:tcPr>
-            <w:tcW w:type="dxa" w:w="1500"/>
-            <w:shd w:fill="F8FAFC"/>
+            <w:tcW w:type="dxa" w:w="1286"/>
+            <w:shd w:fill="FFFFFF"/>
           </w:tcPr>
           <w:p>
             <w:pPr>
@@ -5217,8 +4670,8 @@
         </w:tc>
         <w:tc>
           <w:tcPr>
-            <w:tcW w:type="dxa" w:w="1500"/>
-            <w:shd w:fill="F8FAFC"/>
+            <w:tcW w:type="dxa" w:w="1286"/>
+            <w:shd w:fill="FFFFFF"/>
           </w:tcPr>
           <w:p>
             <w:pPr>
@@ -5233,8 +4686,8 @@
         </w:tc>
         <w:tc>
           <w:tcPr>
-            <w:tcW w:type="dxa" w:w="1500"/>
-            <w:shd w:fill="F8FAFC"/>
+            <w:tcW w:type="dxa" w:w="1286"/>
+            <w:shd w:fill="FFFFFF"/>
           </w:tcPr>
           <w:p>
             <w:pPr>
@@ -5244,9 +4697,15 @@
               <w:rPr>
                 <w:sz w:val="19"/>
               </w:rPr>
-              <w:t>**Rp 9.700.000**</w:t>
+              <w:t>**Rp 1.050.000**</w:t>
             </w:r>
           </w:p>
+        </w:tc>
+        <w:tc>
+          <w:tcPr>
+            <w:tcW w:type="dxa" w:w="1286"/>
+          </w:tcPr>
+          <w:p/>
         </w:tc>
       </w:tr>
     </w:tbl>

</xml_diff>

<commit_message>
docs: Sync user revisions for school credentials (SMKN 8 Semarang, PPLG) across proposal files
</commit_message>
<xml_diff>
--- a/PROPOSAL_BARBERFLOW.docx
+++ b/PROPOSAL_BARBERFLOW.docx
@@ -140,7 +140,7 @@
         <w:t>NIS / NISN:</w:t>
       </w:r>
       <w:r>
-        <w:t xml:space="preserve"> 0081234567 / 0089876543</w:t>
+        <w:t xml:space="preserve"> 11362 / 0099367411</w:t>
       </w:r>
     </w:p>
     <w:p>
@@ -156,7 +156,7 @@
         <w:t>Kompetensi Keahlian:</w:t>
       </w:r>
       <w:r>
-        <w:t xml:space="preserve"> Rekayasa Perangkat Lunak (RPL)</w:t>
+        <w:t xml:space="preserve"> Pengembangan Perangkat Lunak dan Gim (PPLG)</w:t>
       </w:r>
     </w:p>
     <w:p>
@@ -172,7 +172,7 @@
         <w:t>Instansi Sekolah:</w:t>
       </w:r>
       <w:r>
-        <w:t xml:space="preserve"> SMK Negeri 1 Semarang / SMK RPL</w:t>
+        <w:t xml:space="preserve"> SMK Negeri 8 Semarang</w:t>
       </w:r>
     </w:p>
     <w:p>

</xml_diff>

<commit_message>
docs: Update proposal credentials to PPLG and remove unnecessary signature tables
</commit_message>
<xml_diff>
--- a/PROPOSAL_BARBERFLOW.docx
+++ b/PROPOSAL_BARBERFLOW.docx
@@ -50,7 +50,7 @@
         <w:t>Program Keahlian:</w:t>
       </w:r>
       <w:r>
-        <w:t xml:space="preserve"> Rekayasa Perangkat Lunak (RPL)</w:t>
+        <w:t xml:space="preserve"> Pengembangan Perangkat Lunak dan Gim (PPLG)</w:t>
       </w:r>
     </w:p>
     <w:p>
@@ -176,252 +176,6 @@
       </w:r>
     </w:p>
     <w:p>
-      <w:pPr>
-        <w:spacing w:after="80"/>
-      </w:pPr>
-      <w:r>
-        <w:t>Telah diperiksa, disetujui, dan disahkan pada:</w:t>
-      </w:r>
-    </w:p>
-    <w:p>
-      <w:pPr>
-        <w:spacing w:after="80"/>
-      </w:pPr>
-      <w:r/>
-      <w:r>
-        <w:rPr>
-          <w:b/>
-        </w:rPr>
-        <w:t>Hari / Tanggal:</w:t>
-      </w:r>
-      <w:r>
-        <w:t xml:space="preserve"> Senin, 31 Agustus 2026</w:t>
-      </w:r>
-    </w:p>
-    <w:p>
-      <w:pPr>
-        <w:spacing w:after="80"/>
-      </w:pPr>
-      <w:r/>
-      <w:r>
-        <w:rPr>
-          <w:b/>
-        </w:rPr>
-        <w:t>Tempat:</w:t>
-      </w:r>
-      <w:r>
-        <w:t xml:space="preserve"> Semarang, Jawa Tengah</w:t>
-      </w:r>
-    </w:p>
-    <w:p>
-      <w:pPr>
-        <w:spacing w:after="80"/>
-      </w:pPr>
-      <w:r>
-        <w:t>&lt;br/&gt;</w:t>
-      </w:r>
-    </w:p>
-    <w:tbl>
-      <w:tblPr>
-        <w:tblW w:type="auto" w:w="0"/>
-        <w:jc w:val="center"/>
-        <w:tblLook w:firstColumn="1" w:firstRow="1" w:lastColumn="0" w:lastRow="0" w:noHBand="0" w:noVBand="1" w:val="04A0"/>
-        <w:tblBorders>
-          <w:top w:val="single" w:sz="4" w:space="0" w:color="CBD5E1"/>
-          <w:bottom w:val="single" w:sz="4" w:space="0" w:color="CBD5E1"/>
-          <w:insideH w:val="single" w:sz="4" w:space="0" w:color="E2E8F0"/>
-          <w:insideV w:val="none"/>
-          <w:left w:val="none"/>
-          <w:right w:val="none"/>
-        </w:tblBorders>
-      </w:tblPr>
-      <w:tblGrid>
-        <w:gridCol w:w="4500"/>
-        <w:gridCol w:w="4500"/>
-      </w:tblGrid>
-      <w:tr>
-        <w:tc>
-          <w:tcPr>
-            <w:tcW w:type="dxa" w:w="4500"/>
-            <w:shd w:fill="1E293B"/>
-          </w:tcPr>
-          <w:p>
-            <w:pPr>
-              <w:spacing w:before="80" w:after="80"/>
-            </w:pPr>
-            <w:r>
-              <w:rPr>
-                <w:b/>
-                <w:color w:val="FFFFFF"/>
-                <w:sz w:val="20"/>
-              </w:rPr>
-              <w:t>Pembimbing Internal</w:t>
-            </w:r>
-          </w:p>
-        </w:tc>
-        <w:tc>
-          <w:tcPr>
-            <w:tcW w:type="dxa" w:w="4500"/>
-            <w:shd w:fill="1E293B"/>
-          </w:tcPr>
-          <w:p>
-            <w:pPr>
-              <w:spacing w:before="80" w:after="80"/>
-            </w:pPr>
-            <w:r>
-              <w:rPr>
-                <w:b/>
-                <w:color w:val="FFFFFF"/>
-                <w:sz w:val="20"/>
-              </w:rPr>
-              <w:t>Penguji Eksternal (Industri)</w:t>
-            </w:r>
-          </w:p>
-        </w:tc>
-      </w:tr>
-      <w:tr>
-        <w:tc>
-          <w:tcPr>
-            <w:tcW w:type="dxa" w:w="4500"/>
-            <w:shd w:fill="F8FAFC"/>
-          </w:tcPr>
-          <w:p>
-            <w:pPr>
-              <w:spacing w:before="80" w:after="80"/>
-            </w:pPr>
-            <w:r>
-              <w:rPr>
-                <w:sz w:val="19"/>
-              </w:rPr>
-              <w:t>&lt;br/&gt;&lt;br/&gt;________________________&lt;br/&gt;**NIP. 19850115 201001 1 002**</w:t>
-            </w:r>
-          </w:p>
-        </w:tc>
-        <w:tc>
-          <w:tcPr>
-            <w:tcW w:type="dxa" w:w="4500"/>
-            <w:shd w:fill="F8FAFC"/>
-          </w:tcPr>
-          <w:p>
-            <w:pPr>
-              <w:spacing w:before="80" w:after="80"/>
-            </w:pPr>
-            <w:r>
-              <w:rPr>
-                <w:sz w:val="19"/>
-              </w:rPr>
-              <w:t>&lt;br/&gt;&lt;br/&gt;________________________&lt;br/&gt;**Lead Software Engineer**</w:t>
-            </w:r>
-          </w:p>
-        </w:tc>
-      </w:tr>
-    </w:tbl>
-    <w:p/>
-    <w:p>
-      <w:pPr>
-        <w:spacing w:after="80"/>
-      </w:pPr>
-      <w:r>
-        <w:t>&lt;br/&gt;</w:t>
-      </w:r>
-    </w:p>
-    <w:tbl>
-      <w:tblPr>
-        <w:tblW w:type="auto" w:w="0"/>
-        <w:jc w:val="center"/>
-        <w:tblLook w:firstColumn="1" w:firstRow="1" w:lastColumn="0" w:lastRow="0" w:noHBand="0" w:noVBand="1" w:val="04A0"/>
-        <w:tblBorders>
-          <w:top w:val="single" w:sz="4" w:space="0" w:color="CBD5E1"/>
-          <w:bottom w:val="single" w:sz="4" w:space="0" w:color="CBD5E1"/>
-          <w:insideH w:val="single" w:sz="4" w:space="0" w:color="E2E8F0"/>
-          <w:insideV w:val="none"/>
-          <w:left w:val="none"/>
-          <w:right w:val="none"/>
-        </w:tblBorders>
-      </w:tblPr>
-      <w:tblGrid>
-        <w:gridCol w:w="4500"/>
-        <w:gridCol w:w="4500"/>
-      </w:tblGrid>
-      <w:tr>
-        <w:tc>
-          <w:tcPr>
-            <w:tcW w:type="dxa" w:w="4500"/>
-            <w:shd w:fill="1E293B"/>
-          </w:tcPr>
-          <w:p>
-            <w:pPr>
-              <w:spacing w:before="80" w:after="80"/>
-            </w:pPr>
-            <w:r>
-              <w:rPr>
-                <w:b/>
-                <w:color w:val="FFFFFF"/>
-                <w:sz w:val="20"/>
-              </w:rPr>
-              <w:t>Kepala Program Keahlian RPL</w:t>
-            </w:r>
-          </w:p>
-        </w:tc>
-        <w:tc>
-          <w:tcPr>
-            <w:tcW w:type="dxa" w:w="4500"/>
-            <w:shd w:fill="1E293B"/>
-          </w:tcPr>
-          <w:p>
-            <w:pPr>
-              <w:spacing w:before="80" w:after="80"/>
-            </w:pPr>
-            <w:r>
-              <w:rPr>
-                <w:b/>
-                <w:color w:val="FFFFFF"/>
-                <w:sz w:val="20"/>
-              </w:rPr>
-              <w:t>Kepala Sekolah</w:t>
-            </w:r>
-          </w:p>
-        </w:tc>
-      </w:tr>
-      <w:tr>
-        <w:tc>
-          <w:tcPr>
-            <w:tcW w:type="dxa" w:w="4500"/>
-            <w:shd w:fill="F8FAFC"/>
-          </w:tcPr>
-          <w:p>
-            <w:pPr>
-              <w:spacing w:before="80" w:after="80"/>
-            </w:pPr>
-            <w:r>
-              <w:rPr>
-                <w:sz w:val="19"/>
-              </w:rPr>
-              <w:t>&lt;br/&gt;&lt;br/&gt;________________________&lt;br/&gt;**NIP. 19780320 200502 2 001**</w:t>
-            </w:r>
-          </w:p>
-        </w:tc>
-        <w:tc>
-          <w:tcPr>
-            <w:tcW w:type="dxa" w:w="4500"/>
-            <w:shd w:fill="F8FAFC"/>
-          </w:tcPr>
-          <w:p>
-            <w:pPr>
-              <w:spacing w:before="80" w:after="80"/>
-            </w:pPr>
-            <w:r>
-              <w:rPr>
-                <w:sz w:val="19"/>
-              </w:rPr>
-              <w:t>&lt;br/&gt;&lt;br/&gt;________________________&lt;br/&gt;**NIP. 19691212 199403 1 005**</w:t>
-            </w:r>
-          </w:p>
-        </w:tc>
-      </w:tr>
-    </w:tbl>
-    <w:p/>
-    <w:p>
       <w:r>
         <w:t>————————————————————————————————————————</w:t>
       </w:r>
@@ -449,7 +203,7 @@
         <w:t>Proposal Perancangan dan Pembangunan Aplikasi BarberFlow (Classic Barbergo)</w:t>
       </w:r>
       <w:r>
-        <w:t xml:space="preserve"> ini dengan lancar. Proposal ini disusun sebagai bagian dari persiapan pelaksanaan Uji Kompetensi Keahlian (UKK) Rekayasa Perangkat Lunak.</w:t>
+        <w:t xml:space="preserve"> ini dengan lancar. Proposal ini disusun sebagai bagian dari persiapan pelaksanaan Uji Kompetensi Keahlian (UKK) Pengembangan Perangkat Lunak dan Gim (PPLG).</w:t>
       </w:r>
     </w:p>
     <w:p>
@@ -501,7 +255,7 @@
         <w:spacing w:after="60"/>
       </w:pPr>
       <w:r>
-        <w:t>Kepala Sekolah dan Kepala Program Keahlian Rekayasa Perangkat Lunak.</w:t>
+        <w:t>Kepala Sekolah dan Kepala Program Keahlian Pengembangan Perangkat Lunak dan Gim (PPLG).</w:t>
       </w:r>
     </w:p>
     <w:p>
@@ -7142,165 +6896,6 @@
         <w:t>Pengembangan aplikasi berbasis *Mobile Native* (Android/iOS) menggunakan React Native di masa mendatang.</w:t>
       </w:r>
     </w:p>
-    <w:p>
-      <w:r>
-        <w:t>————————————————————————————————————————</w:t>
-      </w:r>
-    </w:p>
-    <w:p>
-      <w:pPr>
-        <w:spacing w:after="80"/>
-      </w:pPr>
-      <w:r/>
-      <w:r>
-        <w:rPr>
-          <w:b/>
-        </w:rPr>
-        <w:t>Mengetahui / Menyetujui:</w:t>
-      </w:r>
-      <w:r/>
-    </w:p>
-    <w:p>
-      <w:pPr>
-        <w:spacing w:after="80"/>
-      </w:pPr>
-      <w:r>
-        <w:t>&lt;br/&gt;</w:t>
-      </w:r>
-    </w:p>
-    <w:tbl>
-      <w:tblPr>
-        <w:tblW w:type="auto" w:w="0"/>
-        <w:jc w:val="center"/>
-        <w:tblLook w:firstColumn="1" w:firstRow="1" w:lastColumn="0" w:lastRow="0" w:noHBand="0" w:noVBand="1" w:val="04A0"/>
-        <w:tblBorders>
-          <w:top w:val="single" w:sz="4" w:space="0" w:color="CBD5E1"/>
-          <w:bottom w:val="single" w:sz="4" w:space="0" w:color="CBD5E1"/>
-          <w:insideH w:val="single" w:sz="4" w:space="0" w:color="E2E8F0"/>
-          <w:insideV w:val="none"/>
-          <w:left w:val="none"/>
-          <w:right w:val="none"/>
-        </w:tblBorders>
-      </w:tblPr>
-      <w:tblGrid>
-        <w:gridCol w:w="3000"/>
-        <w:gridCol w:w="3000"/>
-        <w:gridCol w:w="3000"/>
-      </w:tblGrid>
-      <w:tr>
-        <w:tc>
-          <w:tcPr>
-            <w:tcW w:type="dxa" w:w="3000"/>
-            <w:shd w:fill="1E293B"/>
-          </w:tcPr>
-          <w:p>
-            <w:pPr>
-              <w:spacing w:before="80" w:after="80"/>
-            </w:pPr>
-            <w:r>
-              <w:rPr>
-                <w:b/>
-                <w:color w:val="FFFFFF"/>
-                <w:sz w:val="20"/>
-              </w:rPr>
-              <w:t>Penguji Internal</w:t>
-            </w:r>
-          </w:p>
-        </w:tc>
-        <w:tc>
-          <w:tcPr>
-            <w:tcW w:type="dxa" w:w="3000"/>
-            <w:shd w:fill="1E293B"/>
-          </w:tcPr>
-          <w:p>
-            <w:pPr>
-              <w:spacing w:before="80" w:after="80"/>
-            </w:pPr>
-            <w:r>
-              <w:rPr>
-                <w:b/>
-                <w:color w:val="FFFFFF"/>
-                <w:sz w:val="20"/>
-              </w:rPr>
-              <w:t>Penguji Eksternal</w:t>
-            </w:r>
-          </w:p>
-        </w:tc>
-        <w:tc>
-          <w:tcPr>
-            <w:tcW w:type="dxa" w:w="3000"/>
-            <w:shd w:fill="1E293B"/>
-          </w:tcPr>
-          <w:p>
-            <w:pPr>
-              <w:spacing w:before="80" w:after="80"/>
-            </w:pPr>
-            <w:r>
-              <w:rPr>
-                <w:b/>
-                <w:color w:val="FFFFFF"/>
-                <w:sz w:val="20"/>
-              </w:rPr>
-              <w:t>Siswa Penyusun</w:t>
-            </w:r>
-          </w:p>
-        </w:tc>
-      </w:tr>
-      <w:tr>
-        <w:tc>
-          <w:tcPr>
-            <w:tcW w:type="dxa" w:w="3000"/>
-            <w:shd w:fill="F8FAFC"/>
-          </w:tcPr>
-          <w:p>
-            <w:pPr>
-              <w:spacing w:before="80" w:after="80"/>
-            </w:pPr>
-            <w:r>
-              <w:rPr>
-                <w:sz w:val="19"/>
-              </w:rPr>
-              <w:t>&lt;br/&gt;&lt;br/&gt;( ___________________ )</w:t>
-            </w:r>
-          </w:p>
-        </w:tc>
-        <w:tc>
-          <w:tcPr>
-            <w:tcW w:type="dxa" w:w="3000"/>
-            <w:shd w:fill="F8FAFC"/>
-          </w:tcPr>
-          <w:p>
-            <w:pPr>
-              <w:spacing w:before="80" w:after="80"/>
-            </w:pPr>
-            <w:r>
-              <w:rPr>
-                <w:sz w:val="19"/>
-              </w:rPr>
-              <w:t>&lt;br/&gt;&lt;br/&gt;( ___________________ )</w:t>
-            </w:r>
-          </w:p>
-        </w:tc>
-        <w:tc>
-          <w:tcPr>
-            <w:tcW w:type="dxa" w:w="3000"/>
-            <w:shd w:fill="F8FAFC"/>
-          </w:tcPr>
-          <w:p>
-            <w:pPr>
-              <w:spacing w:before="80" w:after="80"/>
-            </w:pPr>
-            <w:r>
-              <w:rPr>
-                <w:sz w:val="19"/>
-              </w:rPr>
-              <w:t>&lt;br/&gt;&lt;br/&gt;(**Fazle Dzaky A.**)</w:t>
-            </w:r>
-          </w:p>
-        </w:tc>
-      </w:tr>
-    </w:tbl>
-    <w:p/>
     <w:sectPr>
       <w:pgSz w:w="12240" w:h="15840"/>
       <w:pgMar w:top="1440" w:right="1440" w:bottom="1440" w:left="1800" w:header="720" w:footer="720" w:gutter="0"/>

</xml_diff>